<commit_message>
Update Proces upravljanje zalihama.docx
</commit_message>
<xml_diff>
--- a/Rad/Proces upravljanje zalihama.docx
+++ b/Rad/Proces upravljanje zalihama.docx
@@ -763,180 +763,180 @@
           <w:sz w:val="28"/>
           <w:lang w:val="sr-Latn-RS"/>
         </w:rPr>
-        <w:t>Predloženi informacioni sistem za upravljanje zalihama je centralizovano softversko rešenje koje objedinjuje sve procese vezane za praćenje i upravljanje robom u magacinu kompanije MPMTransport. Sistem je namenjen magacionerima, dispečerima, menadžmentu i računovodstvu, a omogućava i komunikaciju sa dobavljačima i servisnim partnerima.</w:t>
-      </w:r>
-    </w:p>
-    <w:p>
-      <w:pPr>
-        <w:rPr>
-          <w:rFonts w:ascii="Calibri"/>
-          <w:sz w:val="28"/>
-          <w:lang w:val="sr-Latn-RS"/>
-        </w:rPr>
-      </w:pPr>
-      <w:r>
-        <w:rPr>
-          <w:rFonts w:ascii="Calibri"/>
-          <w:sz w:val="28"/>
-          <w:lang w:val="sr-Latn-RS"/>
-        </w:rPr>
-        <w:t>Predloženo rešenje uključuje:</w:t>
-      </w:r>
-    </w:p>
-    <w:p>
-      <w:pPr>
-        <w:rPr>
-          <w:rFonts w:ascii="Calibri"/>
-          <w:sz w:val="28"/>
-          <w:lang w:val="sr-Latn-RS"/>
-        </w:rPr>
-      </w:pPr>
-      <w:r>
-        <w:rPr>
-          <w:rFonts w:ascii="Calibri"/>
-          <w:sz w:val="28"/>
-          <w:lang w:val="sr-Latn-RS"/>
-        </w:rPr>
-        <w:t>- analizu postojećih poslovnih procesa vezanih za zalihe,</w:t>
-      </w:r>
-    </w:p>
-    <w:p>
-      <w:pPr>
-        <w:rPr>
-          <w:rFonts w:ascii="Calibri"/>
-          <w:sz w:val="28"/>
-          <w:lang w:val="sr-Latn-RS"/>
-        </w:rPr>
-      </w:pPr>
-      <w:r>
-        <w:rPr>
-          <w:rFonts w:ascii="Calibri"/>
-          <w:sz w:val="28"/>
-          <w:lang w:val="sr-Latn-RS"/>
-        </w:rPr>
-        <w:t>- modelovanje sistema pomoću SSA i IDEFO metodologija,</w:t>
-      </w:r>
-    </w:p>
-    <w:p>
-      <w:pPr>
-        <w:rPr>
-          <w:rFonts w:ascii="Calibri"/>
-          <w:sz w:val="28"/>
-          <w:lang w:val="sr-Latn-RS"/>
-        </w:rPr>
-      </w:pPr>
-      <w:r>
-        <w:rPr>
-          <w:rFonts w:ascii="Calibri"/>
-          <w:sz w:val="28"/>
-          <w:lang w:val="sr-Latn-RS"/>
-        </w:rPr>
-        <w:t>- definisanje strukture podataka kroz MOV dijagram entiteta i veza,</w:t>
-      </w:r>
-    </w:p>
-    <w:p>
-      <w:pPr>
-        <w:rPr>
-          <w:rFonts w:ascii="Calibri"/>
-          <w:sz w:val="28"/>
-          <w:lang w:val="sr-Latn-RS"/>
-        </w:rPr>
-      </w:pPr>
-      <w:r>
-        <w:rPr>
-          <w:rFonts w:ascii="Calibri"/>
-          <w:sz w:val="28"/>
-          <w:lang w:val="sr-Latn-RS"/>
-        </w:rPr>
-        <w:t>- evidenciju artikala sa atributima: naziv, kategorija, količina, minimalna zaliha i lokacija u magacinu,</w:t>
-      </w:r>
-    </w:p>
-    <w:p>
-      <w:pPr>
-        <w:rPr>
-          <w:rFonts w:ascii="Calibri"/>
-          <w:sz w:val="28"/>
-          <w:lang w:val="sr-Latn-RS"/>
-        </w:rPr>
-      </w:pPr>
-      <w:r>
-        <w:rPr>
-          <w:rFonts w:ascii="Calibri"/>
-          <w:sz w:val="28"/>
-          <w:lang w:val="sr-Latn-RS"/>
-        </w:rPr>
-        <w:t>- automatsko upozoravanje kada zaliha padne ispod minimalnog nivoa,</w:t>
-      </w:r>
-    </w:p>
-    <w:p>
-      <w:pPr>
-        <w:rPr>
-          <w:rFonts w:ascii="Calibri"/>
-          <w:sz w:val="28"/>
-          <w:lang w:val="sr-Latn-RS"/>
-        </w:rPr>
-      </w:pPr>
-      <w:r>
-        <w:rPr>
-          <w:rFonts w:ascii="Calibri"/>
-          <w:sz w:val="28"/>
-          <w:lang w:val="sr-Latn-RS"/>
-        </w:rPr>
-        <w:t>- praćenje nabavki i narudžbenica prema dobavljačima,</w:t>
-      </w:r>
-    </w:p>
-    <w:p>
-      <w:pPr>
-        <w:rPr>
-          <w:rFonts w:ascii="Calibri"/>
-          <w:sz w:val="28"/>
-          <w:lang w:val="sr-Latn-RS"/>
-        </w:rPr>
-      </w:pPr>
-      <w:r>
-        <w:rPr>
-          <w:rFonts w:ascii="Calibri"/>
-          <w:sz w:val="28"/>
-          <w:lang w:val="sr-Latn-RS"/>
-        </w:rPr>
-        <w:t>- evidenciju izdavanja robe po vozilima i vozačima,</w:t>
-      </w:r>
-    </w:p>
-    <w:p>
-      <w:pPr>
-        <w:rPr>
-          <w:rFonts w:ascii="Calibri"/>
-          <w:sz w:val="28"/>
-          <w:lang w:val="sr-Latn-RS"/>
-        </w:rPr>
-      </w:pPr>
-      <w:r>
-        <w:rPr>
-          <w:rFonts w:ascii="Calibri"/>
-          <w:sz w:val="28"/>
-          <w:lang w:val="sr-Latn-RS"/>
-        </w:rPr>
-        <w:t>- generisanje izveštaja o stanju zaliha za menadžment i računovodstvo.</w:t>
-      </w:r>
-    </w:p>
-    <w:p>
-      <w:pPr>
-        <w:rPr>
-          <w:rFonts w:ascii="Calibri"/>
-          <w:sz w:val="28"/>
-          <w:lang w:val="sr-Latn-RS"/>
-        </w:rPr>
-      </w:pPr>
-      <w:r>
-        <w:rPr>
-          <w:rFonts w:ascii="Calibri"/>
-          <w:sz w:val="28"/>
-          <w:lang w:val="sr-Latn-RS"/>
-        </w:rPr>
-        <w:t>Sistem je projektovan po principu centralizovane baze podataka kojoj pristupaju svi korisnici u skladu sa dodeljenim pravima pristupa. Svaka izmena stanja zaliha - bilo da se radi o prijemu robe od dobavljača ili izdavanju robe vozačima - automatski se evidentira i ažurira u sistemu, čime se eliminiše mogućnost pojave grešaka usled dupliranja ili zastarelih podataka.</w:t>
+        <w:t>Predloženi informacioni sistem za upravljanje zalihama je centralizovano softversko rešenje koje objedinjuje sve procese vezane za praćenje i upravljanje robom u magacinu kompanije MPMTransport. Sistem je namenjen dispečerima, menadžmentu i računovodstvu, a omogućava i komunikaciju sa dobavljačima i servisnim partnerima.</w:t>
       </w:r>
       <w:bookmarkStart w:id="0" w:name="_GoBack"/>
       <w:bookmarkEnd w:id="0"/>
+    </w:p>
+    <w:p>
+      <w:pPr>
+        <w:rPr>
+          <w:rFonts w:ascii="Calibri"/>
+          <w:sz w:val="28"/>
+          <w:lang w:val="sr-Latn-RS"/>
+        </w:rPr>
+      </w:pPr>
+      <w:r>
+        <w:rPr>
+          <w:rFonts w:ascii="Calibri"/>
+          <w:sz w:val="28"/>
+          <w:lang w:val="sr-Latn-RS"/>
+        </w:rPr>
+        <w:t>Predloženo rešenje uključuje:</w:t>
+      </w:r>
+    </w:p>
+    <w:p>
+      <w:pPr>
+        <w:rPr>
+          <w:rFonts w:ascii="Calibri"/>
+          <w:sz w:val="28"/>
+          <w:lang w:val="sr-Latn-RS"/>
+        </w:rPr>
+      </w:pPr>
+      <w:r>
+        <w:rPr>
+          <w:rFonts w:ascii="Calibri"/>
+          <w:sz w:val="28"/>
+          <w:lang w:val="sr-Latn-RS"/>
+        </w:rPr>
+        <w:t>- analizu postojećih poslovnih procesa vezanih za zalihe,</w:t>
+      </w:r>
+    </w:p>
+    <w:p>
+      <w:pPr>
+        <w:rPr>
+          <w:rFonts w:ascii="Calibri"/>
+          <w:sz w:val="28"/>
+          <w:lang w:val="sr-Latn-RS"/>
+        </w:rPr>
+      </w:pPr>
+      <w:r>
+        <w:rPr>
+          <w:rFonts w:ascii="Calibri"/>
+          <w:sz w:val="28"/>
+          <w:lang w:val="sr-Latn-RS"/>
+        </w:rPr>
+        <w:t>- modelovanje sistema pomoću SSA i IDEFO metodologija,</w:t>
+      </w:r>
+    </w:p>
+    <w:p>
+      <w:pPr>
+        <w:rPr>
+          <w:rFonts w:ascii="Calibri"/>
+          <w:sz w:val="28"/>
+          <w:lang w:val="sr-Latn-RS"/>
+        </w:rPr>
+      </w:pPr>
+      <w:r>
+        <w:rPr>
+          <w:rFonts w:ascii="Calibri"/>
+          <w:sz w:val="28"/>
+          <w:lang w:val="sr-Latn-RS"/>
+        </w:rPr>
+        <w:t>- definisanje strukture podataka kroz MOV dijagram entiteta i veza,</w:t>
+      </w:r>
+    </w:p>
+    <w:p>
+      <w:pPr>
+        <w:rPr>
+          <w:rFonts w:ascii="Calibri"/>
+          <w:sz w:val="28"/>
+          <w:lang w:val="sr-Latn-RS"/>
+        </w:rPr>
+      </w:pPr>
+      <w:r>
+        <w:rPr>
+          <w:rFonts w:ascii="Calibri"/>
+          <w:sz w:val="28"/>
+          <w:lang w:val="sr-Latn-RS"/>
+        </w:rPr>
+        <w:t>- evidenciju artikala sa atributima: naziv, kategorija, količina, minimalna zaliha i lokacija u magacinu,</w:t>
+      </w:r>
+    </w:p>
+    <w:p>
+      <w:pPr>
+        <w:rPr>
+          <w:rFonts w:ascii="Calibri"/>
+          <w:sz w:val="28"/>
+          <w:lang w:val="sr-Latn-RS"/>
+        </w:rPr>
+      </w:pPr>
+      <w:r>
+        <w:rPr>
+          <w:rFonts w:ascii="Calibri"/>
+          <w:sz w:val="28"/>
+          <w:lang w:val="sr-Latn-RS"/>
+        </w:rPr>
+        <w:t>- automatsko upozoravanje kada zaliha padne ispod minimalnog nivoa,</w:t>
+      </w:r>
+    </w:p>
+    <w:p>
+      <w:pPr>
+        <w:rPr>
+          <w:rFonts w:ascii="Calibri"/>
+          <w:sz w:val="28"/>
+          <w:lang w:val="sr-Latn-RS"/>
+        </w:rPr>
+      </w:pPr>
+      <w:r>
+        <w:rPr>
+          <w:rFonts w:ascii="Calibri"/>
+          <w:sz w:val="28"/>
+          <w:lang w:val="sr-Latn-RS"/>
+        </w:rPr>
+        <w:t>- praćenje nabavki i narudžbenica prema dobavljačima,</w:t>
+      </w:r>
+    </w:p>
+    <w:p>
+      <w:pPr>
+        <w:rPr>
+          <w:rFonts w:ascii="Calibri"/>
+          <w:sz w:val="28"/>
+          <w:lang w:val="sr-Latn-RS"/>
+        </w:rPr>
+      </w:pPr>
+      <w:r>
+        <w:rPr>
+          <w:rFonts w:ascii="Calibri"/>
+          <w:sz w:val="28"/>
+          <w:lang w:val="sr-Latn-RS"/>
+        </w:rPr>
+        <w:t>- evidenciju izdavanja robe po vozilima i vozačima,</w:t>
+      </w:r>
+    </w:p>
+    <w:p>
+      <w:pPr>
+        <w:rPr>
+          <w:rFonts w:ascii="Calibri"/>
+          <w:sz w:val="28"/>
+          <w:lang w:val="sr-Latn-RS"/>
+        </w:rPr>
+      </w:pPr>
+      <w:r>
+        <w:rPr>
+          <w:rFonts w:ascii="Calibri"/>
+          <w:sz w:val="28"/>
+          <w:lang w:val="sr-Latn-RS"/>
+        </w:rPr>
+        <w:t>- generisanje izveštaja o stanju zaliha za menadžment i računovodstvo.</w:t>
+      </w:r>
+    </w:p>
+    <w:p>
+      <w:pPr>
+        <w:rPr>
+          <w:rFonts w:ascii="Calibri"/>
+          <w:sz w:val="28"/>
+          <w:lang w:val="sr-Latn-RS"/>
+        </w:rPr>
+      </w:pPr>
+      <w:r>
+        <w:rPr>
+          <w:rFonts w:ascii="Calibri"/>
+          <w:sz w:val="28"/>
+          <w:lang w:val="sr-Latn-RS"/>
+        </w:rPr>
+        <w:t>Sistem je projektovan po principu centralizovane baze podataka kojoj pristupaju svi korisnici u skladu sa dodeljenim pravima pristupa. Svaka izmena stanja zaliha - bilo da se radi o prijemu robe od dobavljača ili izdavanju robe vozačima - automatski se evidentira i ažurira u sistemu, čime se eliminiše mogućnost pojave grešaka usled dupliranja ili zastarelih podataka.</w:t>
+      </w:r>
       <w:r>
         <w:rPr>
           <w:rFonts w:ascii="Calibri"/>
@@ -1251,14 +1251,7 @@
           <w:sz w:val="28"/>
         </w:rPr>
         <w:lastRenderedPageBreak/>
-        <w:t>2</w:t>
-      </w:r>
-      <w:r>
-        <w:rPr>
-          <w:rFonts w:ascii="Calibri"/>
-          <w:sz w:val="28"/>
-        </w:rPr>
-        <w:t xml:space="preserve">.2.2 </w:t>
+        <w:t xml:space="preserve">2.2.2 </w:t>
       </w:r>
       <w:proofErr w:type="spellStart"/>
       <w:r>
@@ -1331,8 +1324,8 @@
           <w:sz w:val="28"/>
         </w:rPr>
         <w:pict>
-          <v:shape id="_x0000_i1030" type="#_x0000_t75" style="width:301.1pt;height:383.4pt">
-            <v:imagedata r:id="rId9" o:title="Untitled Diagram.drawio (2)"/>
+          <v:shape id="_x0000_i1027" type="#_x0000_t75" style="width:301.1pt;height:383.4pt">
+            <v:imagedata r:id="rId9" o:title="Untitled Diagram"/>
           </v:shape>
         </w:pict>
       </w:r>
@@ -1357,28 +1350,7 @@
           <w:sz w:val="28"/>
         </w:rPr>
         <w:lastRenderedPageBreak/>
-        <w:t>2</w:t>
-      </w:r>
-      <w:r>
-        <w:rPr>
-          <w:rFonts w:ascii="Calibri"/>
-          <w:sz w:val="28"/>
-        </w:rPr>
-        <w:t>.2.</w:t>
-      </w:r>
-      <w:r>
-        <w:rPr>
-          <w:rFonts w:ascii="Calibri"/>
-          <w:sz w:val="28"/>
-        </w:rPr>
-        <w:t>3</w:t>
-      </w:r>
-      <w:r>
-        <w:rPr>
-          <w:rFonts w:ascii="Calibri"/>
-          <w:sz w:val="28"/>
-        </w:rPr>
-        <w:t xml:space="preserve"> </w:t>
+        <w:t xml:space="preserve">2.2.3 </w:t>
       </w:r>
       <w:proofErr w:type="spellStart"/>
       <w:r>
@@ -1394,21 +1366,7 @@
           <w:rFonts w:ascii="Calibri"/>
           <w:sz w:val="28"/>
         </w:rPr>
-        <w:t xml:space="preserve"> </w:t>
-      </w:r>
-      <w:r>
-        <w:rPr>
-          <w:rFonts w:ascii="Calibri"/>
-          <w:sz w:val="28"/>
-        </w:rPr>
-        <w:t>3</w:t>
-      </w:r>
-      <w:r>
-        <w:rPr>
-          <w:rFonts w:ascii="Calibri"/>
-          <w:sz w:val="28"/>
-        </w:rPr>
-        <w:t xml:space="preserve"> </w:t>
+        <w:t xml:space="preserve"> 3 </w:t>
       </w:r>
       <w:proofErr w:type="spellStart"/>
       <w:r>
@@ -1440,8 +1398,8 @@
           <w:sz w:val="28"/>
         </w:rPr>
         <w:pict>
-          <v:shape id="_x0000_i1031" type="#_x0000_t75" style="width:450.7pt;height:405.8pt">
-            <v:imagedata r:id="rId10" o:title="Untitled Diagram.drawio (3)"/>
+          <v:shape id="_x0000_i1028" type="#_x0000_t75" style="width:450.7pt;height:405.8pt">
+            <v:imagedata r:id="rId10" o:title="Untitled Diagram"/>
           </v:shape>
         </w:pict>
       </w:r>
@@ -1482,28 +1440,7 @@
           <w:sz w:val="28"/>
         </w:rPr>
         <w:lastRenderedPageBreak/>
-        <w:t>2</w:t>
-      </w:r>
-      <w:r>
-        <w:rPr>
-          <w:rFonts w:ascii="Calibri"/>
-          <w:sz w:val="28"/>
-        </w:rPr>
-        <w:t>.2.</w:t>
-      </w:r>
-      <w:r>
-        <w:rPr>
-          <w:rFonts w:ascii="Calibri"/>
-          <w:sz w:val="28"/>
-        </w:rPr>
-        <w:t>4</w:t>
-      </w:r>
-      <w:r>
-        <w:rPr>
-          <w:rFonts w:ascii="Calibri"/>
-          <w:sz w:val="28"/>
-        </w:rPr>
-        <w:t xml:space="preserve"> </w:t>
+        <w:t xml:space="preserve">2.2.4 </w:t>
       </w:r>
       <w:proofErr w:type="spellStart"/>
       <w:r>
@@ -1519,21 +1456,7 @@
           <w:rFonts w:ascii="Calibri"/>
           <w:sz w:val="28"/>
         </w:rPr>
-        <w:t xml:space="preserve"> </w:t>
-      </w:r>
-      <w:r>
-        <w:rPr>
-          <w:rFonts w:ascii="Calibri"/>
-          <w:sz w:val="28"/>
-        </w:rPr>
-        <w:t>4</w:t>
-      </w:r>
-      <w:r>
-        <w:rPr>
-          <w:rFonts w:ascii="Calibri"/>
-          <w:sz w:val="28"/>
-        </w:rPr>
-        <w:t xml:space="preserve"> </w:t>
+        <w:t xml:space="preserve"> 4 </w:t>
       </w:r>
       <w:proofErr w:type="spellStart"/>
       <w:r>
@@ -1558,8 +1481,8 @@
           <w:sz w:val="28"/>
         </w:rPr>
         <w:pict>
-          <v:shape id="_x0000_i1032" type="#_x0000_t75" style="width:420.8pt;height:428.25pt">
-            <v:imagedata r:id="rId11" o:title="Untitled Diagram.drawio (4)"/>
+          <v:shape id="_x0000_i1029" type="#_x0000_t75" style="width:420.8pt;height:428.25pt">
+            <v:imagedata r:id="rId11" o:title="Untitled Diagram"/>
           </v:shape>
         </w:pict>
       </w:r>
@@ -1654,7 +1577,7 @@
           <w:sz w:val="28"/>
         </w:rPr>
         <w:pict>
-          <v:shape id="_x0000_i1027" type="#_x0000_t75" style="width:386.2pt;height:321.65pt">
+          <v:shape id="_x0000_i1030" type="#_x0000_t75" style="width:386.2pt;height:321.65pt">
             <v:imagedata r:id="rId12" o:title="idef0"/>
           </v:shape>
         </w:pict>
@@ -1744,7 +1667,7 @@
           <w:sz w:val="28"/>
         </w:rPr>
         <w:pict>
-          <v:shape id="_x0000_i1028" type="#_x0000_t75" style="width:467.55pt;height:241.25pt">
+          <v:shape id="_x0000_i1031" type="#_x0000_t75" style="width:467.55pt;height:241.25pt">
             <v:imagedata r:id="rId13" o:title="Untitled Diagram"/>
           </v:shape>
         </w:pict>
@@ -1811,7 +1734,7 @@
           <w:sz w:val="28"/>
         </w:rPr>
         <w:pict>
-          <v:shape id="_x0000_i1029" type="#_x0000_t75" style="width:467.55pt;height:340.35pt">
+          <v:shape id="_x0000_i1032" type="#_x0000_t75" style="width:467.55pt;height:340.35pt">
             <v:imagedata r:id="rId14" o:title="Untitled Diagram"/>
           </v:shape>
         </w:pict>

</xml_diff>